<commit_message>
bezpieczenstwo narodowe: pierwsza praca w sklepie - zarzadzanie kryzysowe w gminie (59 zl, zestaw 79 zl)
Praca z autopilota po naprawie: akty prawne wg aktualnych tekstow jednolitych (ELI),
nowa ustawa o ochronie ludnosci i obronie cywilnej (Dz.U. 2024 poz. 1907) w 1.2 i 2.2,
usuniete uchylone rozporzadzenia, przypisy pod fikcyjnym badaniem zdjete (22 pozycje
bibliografii zamiast 32), odtworzony podrozdzial 4.1, zanonimizowana gmina, usuniete
wtracenia generatora. build-prace: --enable-installer (MiKTeX).
</commit_message>
<xml_diff>
--- a/public/downloads/przykladowa-praca-magisterska-bezpieczenstwo-narodowe.docx
+++ b/public/downloads/przykladowa-praca-magisterska-bezpieczenstwo-narodowe.docx
@@ -818,7 +818,7 @@
           <w:b/>
           <w:bCs/>
         </w:rPr>
-        <w:t xml:space="preserve">„Jak napisać pracę magisterską z bezpieczeństwa narodowego” — przewodnik do tego wzoru</w:t>
+        <w:t xml:space="preserve">Ten wzór to szkielet. Tak wygląda praca napisana w całości.</w:t>
       </w:r>
     </w:p>
     <w:p>
@@ -826,47 +826,57 @@
         <w:pStyle w:val="Note"/>
       </w:pPr>
       <w:r>
-        <w:t xml:space="preserve">Wzór pokazuje układ pracy. Przewodnik pokazuje, jak wypełnić każdy rozdział treścią: dobór metody i narzędzi, analiza wyników, typowe uwagi recenzentów. PDF + EPUB, 49 zł, dostęp od razu po płatności.</w:t>
-      </w:r>
-    </w:p>
-    <w:p>
-      <w:pPr>
-        <w:pStyle w:val="Note"/>
+        <w:t xml:space="preserve">Kompletne prace magisterskie na konkretnych tematach, z przypisami wskazującymi numer strony w źródle i pełną bibliografią. 59 zł za pracę, PDF + Word, pobierasz od razu po płatności:</w:t>
+      </w:r>
+    </w:p>
+    <w:p>
+      <w:pPr>
+        <w:pStyle w:val="Compact"/>
+        <w:numPr>
+          <w:ilvl w:val="0"/>
+          <w:numId w:val="1003"/>
+        </w:numPr>
       </w:pPr>
       <w:hyperlink r:id="rId20">
+        <w:r>
+          <w:rPr>
+            <w:rStyle w:val="Hyperlink"/>
+          </w:rPr>
+          <w:t xml:space="preserve">System zarządzania kryzysowego w Polsce – organizacja na poziomie gminy</w:t>
+        </w:r>
+      </w:hyperlink>
+      <w:r>
+        <w:t xml:space="preserve"> </w:t>
+      </w:r>
+      <w:r>
+        <w:t xml:space="preserve">— 67 stron, 58 przypisów</w:t>
+      </w:r>
+    </w:p>
+    <w:p>
+      <w:pPr>
+        <w:pStyle w:val="BodyText"/>
+      </w:pPr>
+      <w:r>
+        <w:t xml:space="preserve">Wolisz napisać pracę samodzielnie? Przewodnik</w:t>
+      </w:r>
+      <w:r>
+        <w:t xml:space="preserve"> </w:t>
+      </w:r>
+      <w:hyperlink r:id="rId21">
         <w:r>
           <w:rPr>
             <w:rStyle w:val="Hyperlink"/>
             <w:b/>
             <w:bCs/>
           </w:rPr>
-          <w:t xml:space="preserve">praca-magisterska.pl/sklep/jak-napisac-prace-magisterska-z-bezpieczenstwa-narodowego/</w:t>
+          <w:t xml:space="preserve">„Jak napisać pracę magisterską z bezpieczeństwa narodowego”</w:t>
         </w:r>
       </w:hyperlink>
-    </w:p>
-    <w:p>
-      <w:pPr>
-        <w:pStyle w:val="BodyText"/>
-      </w:pPr>
-      <w:r>
-        <w:t xml:space="preserve">Chcesz zobaczyć kompletną pracę z przypisami i bibliografią? Zajrzyj do</w:t>
-      </w:r>
-      <w:r>
-        <w:t xml:space="preserve"> </w:t>
-      </w:r>
-      <w:hyperlink r:id="rId21">
-        <w:r>
-          <w:rPr>
-            <w:rStyle w:val="Hyperlink"/>
-          </w:rPr>
-          <w:t xml:space="preserve">katalogu gotowych prac wzorcowych</w:t>
-        </w:r>
-      </w:hyperlink>
-      <w:r>
-        <w:t xml:space="preserve"> </w:t>
-      </w:r>
-      <w:r>
-        <w:t xml:space="preserve">(59 zł za pracę).</w:t>
+      <w:r>
+        <w:t xml:space="preserve"> </w:t>
+      </w:r>
+      <w:r>
+        <w:t xml:space="preserve">prowadzi przez dobór metody, narzędzia, analizę wyników i pisanie kolejnych rozdziałów (49 zł).</w:t>
       </w:r>
     </w:p>
     <w:p>
@@ -1109,6 +1119,109 @@
       <w:pPr>
         <w:ind w:left="6480" w:hanging="360"/>
       </w:pPr>
+    </w:lvl>
+  </w:abstractNum>
+  <w:abstractNum w:abstractNumId="991">
+    <w:nsid w:val="0000A991"/>
+    <w:multiLevelType w:val="multilevel"/>
+    <w:lvl w:ilvl="0">
+      <w:numFmt w:val="bullet"/>
+      <w:lvlText w:val=""/>
+      <w:lvlJc w:val="left"/>
+      <w:pPr>
+        <w:ind w:left="720" w:hanging="360"/>
+      </w:pPr>
+      <w:rPr>
+        <w:rFonts w:ascii="Symbol" w:hAnsi="Symbol" w:cs="Symbol" w:hint="default"/>
+      </w:rPr>
+    </w:lvl>
+    <w:lvl w:ilvl="1">
+      <w:numFmt w:val="bullet"/>
+      <w:lvlText w:val="o"/>
+      <w:lvlJc w:val="left"/>
+      <w:pPr>
+        <w:ind w:left="1440" w:hanging="360"/>
+      </w:pPr>
+      <w:rPr>
+        <w:rFonts w:ascii="Courier New" w:hAnsi="Courier New" w:cs="Courier New" w:hint="default"/>
+      </w:rPr>
+    </w:lvl>
+    <w:lvl w:ilvl="2">
+      <w:numFmt w:val="bullet"/>
+      <w:lvlText w:val=""/>
+      <w:lvlJc w:val="left"/>
+      <w:pPr>
+        <w:ind w:left="2160" w:hanging="360"/>
+      </w:pPr>
+      <w:rPr>
+        <w:rFonts w:ascii="Wingdings" w:hAnsi="Wingdings" w:cs="Wingdings" w:hint="default"/>
+      </w:rPr>
+    </w:lvl>
+    <w:lvl w:ilvl="3">
+      <w:numFmt w:val="bullet"/>
+      <w:lvlText w:val=""/>
+      <w:lvlJc w:val="left"/>
+      <w:pPr>
+        <w:ind w:left="2880" w:hanging="360"/>
+      </w:pPr>
+      <w:rPr>
+        <w:rFonts w:ascii="Symbol" w:hAnsi="Symbol" w:cs="Symbol" w:hint="default"/>
+      </w:rPr>
+    </w:lvl>
+    <w:lvl w:ilvl="4">
+      <w:numFmt w:val="bullet"/>
+      <w:lvlText w:val="o"/>
+      <w:lvlJc w:val="left"/>
+      <w:pPr>
+        <w:ind w:left="3600" w:hanging="360"/>
+      </w:pPr>
+      <w:rPr>
+        <w:rFonts w:ascii="Courier New" w:hAnsi="Courier New" w:cs="Courier New" w:hint="default"/>
+      </w:rPr>
+    </w:lvl>
+    <w:lvl w:ilvl="5">
+      <w:numFmt w:val="bullet"/>
+      <w:lvlText w:val=""/>
+      <w:lvlJc w:val="left"/>
+      <w:pPr>
+        <w:ind w:left="4320" w:hanging="360"/>
+      </w:pPr>
+      <w:rPr>
+        <w:rFonts w:ascii="Wingdings" w:hAnsi="Wingdings" w:cs="Wingdings" w:hint="default"/>
+      </w:rPr>
+    </w:lvl>
+    <w:lvl w:ilvl="6">
+      <w:numFmt w:val="bullet"/>
+      <w:lvlText w:val=""/>
+      <w:lvlJc w:val="left"/>
+      <w:pPr>
+        <w:ind w:left="5040" w:hanging="360"/>
+      </w:pPr>
+      <w:rPr>
+        <w:rFonts w:ascii="Symbol" w:hAnsi="Symbol" w:cs="Symbol" w:hint="default"/>
+      </w:rPr>
+    </w:lvl>
+    <w:lvl w:ilvl="7">
+      <w:numFmt w:val="bullet"/>
+      <w:lvlText w:val="o"/>
+      <w:lvlJc w:val="left"/>
+      <w:pPr>
+        <w:ind w:left="5760" w:hanging="360"/>
+      </w:pPr>
+      <w:rPr>
+        <w:rFonts w:ascii="Courier New" w:hAnsi="Courier New" w:cs="Courier New" w:hint="default"/>
+      </w:rPr>
+    </w:lvl>
+    <w:lvl w:ilvl="8">
+      <w:numFmt w:val="bullet"/>
+      <w:lvlText w:val=""/>
+      <w:lvlJc w:val="left"/>
+      <w:pPr>
+        <w:ind w:left="6480" w:hanging="360"/>
+      </w:pPr>
+      <w:rPr>
+        <w:rFonts w:ascii="Wingdings" w:hAnsi="Wingdings" w:cs="Wingdings" w:hint="default"/>
+      </w:rPr>
     </w:lvl>
   </w:abstractNum>
   <w:num w:numId="1000">
@@ -1173,6 +1286,9 @@
     <w:lvlOverride w:ilvl="8">
       <w:startOverride w:val="1"/>
     </w:lvlOverride>
+  </w:num>
+  <w:num w:numId="1003">
+    <w:abstractNumId w:val="991"/>
   </w:num>
 </w:numbering>
 </file>

</xml_diff>